<commit_message>
Documents Word mis a jour : mesure d'audience, sous-traitants du site, hebergeur du site
</commit_message>
<xml_diff>
--- a/reference/pages-legales/Mentions légales SAFIA 12 août 2026.docx
+++ b/reference/pages-legales/Mentions légales SAFIA 12 août 2026.docx
@@ -30,22 +30,7 @@
         </w:rPr>
       </w:pPr>
       <w:r>
-        <w:rPr>
-          <w:lang w:val="fr-FR"/>
-        </w:rPr>
-        <w:t xml:space="preserve">Dernière modification : </w:t>
-      </w:r>
-      <w:r>
-        <w:rPr>
-          <w:lang w:val="fr-FR"/>
-        </w:rPr>
-        <w:t xml:space="preserve">12 août </w:t>
-      </w:r>
-      <w:r>
-        <w:rPr>
-          <w:lang w:val="fr-FR"/>
-        </w:rPr>
-        <w:t>2026</w:t>
+        <w:t xml:space="preserve">Dernière modification : 16 septembre 2026</w:t>
       </w:r>
     </w:p>
     <w:p>
@@ -349,10 +334,7 @@
         </w:rPr>
       </w:pPr>
       <w:r>
-        <w:rPr>
-          <w:lang w:val="fr-FR"/>
-        </w:rPr>
-        <w:t>Le site internet et l'infrastructure de l'application SAFIA sont hébergés par :</w:t>
+        <w:t xml:space="preserve">L'infrastructure de l'application SAFIA est hébergée par :</w:t>
       </w:r>
     </w:p>
     <w:p>
@@ -405,6 +387,11 @@
           <w:lang w:val="fr-FR"/>
         </w:rPr>
         <w:t>Les données sont hébergées sur des infrastructures situées à Paris et à Frankfurt, au sein de l'Union européenne.</w:t>
+      </w:r>
+    </w:p>
+    <w:p>
+      <w:r>
+        <w:t xml:space="preserve">Le site internet safia.finance est hébergé par GitHub, Inc., 88 Colin P. Kelly Jr. Street, San Francisco, CA 94107, États-Unis, via le service GitHub Pages.</w:t>
       </w:r>
     </w:p>
     <w:p>

</xml_diff>